<commit_message>
Updated Bible study notes and resources for multiple languages for 2026-05-19 release
</commit_message>
<xml_diff>
--- a/hin/docx/41.content.docx
+++ b/hin/docx/41.content.docx
@@ -212,7 +212,7 @@
         <w:rPr>
           <w:lang w:val="hi_IN" w:bidi="hi_IN"/>
         </w:rPr>
-        <w:t>मरकुस 10:40</w:t>
+        <w:t>मरकुस 9:43</w:t>
       </w:r>
       <w:r>
         <w:rPr>
@@ -231,9 +231,162 @@
         <w:rPr>
           <w:lang w:val="hi_IN" w:bidi="hi_IN"/>
         </w:rPr>
+        <w:t xml:space="preserve">नरक: यूनानी </w:t>
+      </w:r>
+      <w:r>
+        <w:rPr>
+          <w:i/>
+          <w:lang w:val="hi_IN" w:bidi="hi_IN"/>
+        </w:rPr>
+        <w:t>गेहेन्ना,</w:t>
+      </w:r>
+      <w:r>
+        <w:rPr>
+          <w:lang w:val="hi_IN" w:bidi="hi_IN"/>
+        </w:rPr>
+        <w:t xml:space="preserve"> हिन्नोम घाटी का उल्लेख करते हुए, जो दक्षिण-पश्चिम में यरूशलेम की सीमा पर स्थित है। यह नरक के लिए एक रूपक बन गया क्योंकि इस्राएलियों ने वहां अपने बच्चों को बलि के रूप में चढ़ाया था (</w:t>
+      </w:r>
+      <w:hyperlink r:id="rId13">
+        <w:r>
+          <w:rPr>
+            <w:lang w:val="hi_IN" w:bidi="hi_IN"/>
+          </w:rPr>
+          <w:rPr>
+            <w:color w:val="0000EE"/>
+            <w:u w:val="single"/>
+          </w:rPr>
+          <w:t>यिर्म 32:35</w:t>
+        </w:r>
+      </w:hyperlink>
+      <w:r>
+        <w:rPr>
+          <w:lang w:val="hi_IN" w:bidi="hi_IN"/>
+        </w:rPr>
+        <w:t>)।</w:t>
+      </w:r>
+      <w:r>
+        <w:rPr>
+          <w:lang w:val="hi_IN" w:bidi="hi_IN"/>
+        </w:rPr>
+      </w:r>
+      <w:r>
+        <w:rPr>
+          <w:lang w:val="hi_IN" w:bidi="hi_IN"/>
+        </w:rPr>
+      </w:r>
+    </w:p>
+    <w:p>
+      <w:pPr/>
+      <w:r>
+        <w:rPr>
+          <w:lang w:val="hi_IN" w:bidi="hi_IN"/>
+        </w:rPr>
+      </w:r>
+    </w:p>
+    <w:p>
+      <w:pPr>
+        <w:pStyle w:val="Heading2"/>
+      </w:pPr>
+      <w:r>
+        <w:rPr>
+          <w:lang w:val="hi_IN" w:bidi="hi_IN"/>
+        </w:rPr>
+        <w:t>मरकुस 9:48</w:t>
+      </w:r>
+      <w:r>
+        <w:rPr>
+          <w:lang w:val="hi_IN" w:bidi="hi_IN"/>
+        </w:rPr>
+      </w:r>
+    </w:p>
+    <w:p>
+      <w:pPr/>
+      <w:r>
+        <w:rPr>
+          <w:lang w:val="hi_IN" w:bidi="hi_IN"/>
+        </w:rPr>
+      </w:r>
+      <w:r>
+        <w:rPr>
+          <w:lang w:val="hi_IN" w:bidi="hi_IN"/>
+        </w:rPr>
+        <w:t xml:space="preserve">नरक की अनंतता को कभी न मरने और कभी न बुझने वाले वाक्यांशों द्वारा ज़ोर दिया गया है (तुलना करें </w:t>
+      </w:r>
+      <w:hyperlink r:id="rId14">
+        <w:r>
+          <w:rPr>
+            <w:lang w:val="hi_IN" w:bidi="hi_IN"/>
+          </w:rPr>
+          <w:rPr>
+            <w:color w:val="0000EE"/>
+            <w:u w:val="single"/>
+          </w:rPr>
+          <w:t>9:43</w:t>
+        </w:r>
+      </w:hyperlink>
+      <w:r>
+        <w:rPr>
+          <w:lang w:val="hi_IN" w:bidi="hi_IN"/>
+        </w:rPr>
+        <w:t>)। नरक की भयावहता को उसके चित्रण द्वारा एक अनंतकालीन आग और सड़न तथा भ्रष्टाचार के स्थान के रूप में जोर दिया गया है, जहाँ कीड़े अनंतकाल तक सब कुछ खाते रहते हैं। यह चित्रण लोगों को नरक की सजा से बचने के लिए पश्चाताप करने हेतु एक शक्तिशाली चेतावनी है।</w:t>
+      </w:r>
+    </w:p>
+    <w:p>
+      <w:pPr/>
+      <w:r>
+        <w:rPr>
+          <w:lang w:val="hi_IN" w:bidi="hi_IN"/>
+        </w:rPr>
+      </w:r>
+      <w:r>
+        <w:rPr>
+          <w:lang w:val="hi_IN" w:bidi="hi_IN"/>
+        </w:rPr>
+      </w:r>
+      <w:r>
+        <w:rPr>
+          <w:lang w:val="hi_IN" w:bidi="hi_IN"/>
+        </w:rPr>
+      </w:r>
+    </w:p>
+    <w:p>
+      <w:pPr/>
+      <w:r>
+        <w:rPr>
+          <w:lang w:val="hi_IN" w:bidi="hi_IN"/>
+        </w:rPr>
+      </w:r>
+    </w:p>
+    <w:p>
+      <w:pPr>
+        <w:pStyle w:val="Heading2"/>
+      </w:pPr>
+      <w:r>
+        <w:rPr>
+          <w:lang w:val="hi_IN" w:bidi="hi_IN"/>
+        </w:rPr>
+        <w:t>मरकुस 10:40</w:t>
+      </w:r>
+      <w:r>
+        <w:rPr>
+          <w:lang w:val="hi_IN" w:bidi="hi_IN"/>
+        </w:rPr>
+      </w:r>
+    </w:p>
+    <w:p>
+      <w:pPr/>
+      <w:r>
+        <w:rPr>
+          <w:lang w:val="hi_IN" w:bidi="hi_IN"/>
+        </w:rPr>
+      </w:r>
+      <w:r>
+        <w:rPr>
+          <w:lang w:val="hi_IN" w:bidi="hi_IN"/>
+        </w:rPr>
         <w:t xml:space="preserve">यीशु ने उनकी विनती पूरी नहीं की। ये स्थान उन लोगों के लिए हैं जिनके लिए परमपिता परमेश्वर ने इन्हें तैयार किया है (यह भी देखें: </w:t>
       </w:r>
-      <w:hyperlink r:id="rId13">
+      <w:hyperlink r:id="rId15">
         <w:r>
           <w:rPr>
             <w:lang w:val="hi_IN" w:bidi="hi_IN"/>
@@ -317,7 +470,7 @@
         </w:rPr>
         <w:t xml:space="preserve"> </w:t>
       </w:r>
-      <w:hyperlink r:id="rId14">
+      <w:hyperlink r:id="rId16">
         <w:r>
           <w:rPr>
             <w:lang w:val="hi_IN" w:bidi="hi_IN"/>
@@ -335,7 +488,7 @@
         </w:rPr>
         <w:t xml:space="preserve">; </w:t>
       </w:r>
-      <w:hyperlink r:id="rId15">
+      <w:hyperlink r:id="rId17">
         <w:r>
           <w:rPr>
             <w:lang w:val="hi_IN" w:bidi="hi_IN"/>
@@ -479,7 +632,7 @@
         </w:rPr>
         <w:t xml:space="preserve">जहाँ उसे नहीं होना चाहिए वहाँ खड़ा होना: ऐतिहासिक पृष्ठभूमि और यरूशलेम (मरकुस </w:t>
       </w:r>
-      <w:hyperlink r:id="rId16">
+      <w:hyperlink r:id="rId18">
         <w:r>
           <w:rPr>
             <w:lang w:val="hi_IN" w:bidi="hi_IN"/>
@@ -497,7 +650,7 @@
         </w:rPr>
         <w:t xml:space="preserve">, </w:t>
       </w:r>
-      <w:hyperlink r:id="rId17">
+      <w:hyperlink r:id="rId19">
         <w:r>
           <w:rPr>
             <w:lang w:val="hi_IN" w:bidi="hi_IN"/>
@@ -521,7 +674,7 @@
         </w:rPr>
         <w:t>और यहूदिया (</w:t>
       </w:r>
-      <w:hyperlink r:id="rId18">
+      <w:hyperlink r:id="rId20">
         <w:r>
           <w:rPr>
             <w:lang w:val="hi_IN" w:bidi="hi_IN"/>
@@ -1116,7 +1269,7 @@
         </w:rPr>
         <w:t xml:space="preserve">थिस्स </w:t>
       </w:r>
-      <w:hyperlink r:id="rId19">
+      <w:hyperlink r:id="rId21">
         <w:r>
           <w:rPr>
             <w:lang w:val="hi_IN" w:bidi="hi_IN"/>
@@ -1176,7 +1329,7 @@
         </w:rPr>
         <w:t xml:space="preserve">उसकी वेदी और उसके बलिदान संबंधी अनुष्ठान शामिल हैं। मरकुस </w:t>
       </w:r>
-      <w:hyperlink r:id="rId20">
+      <w:hyperlink r:id="rId22">
         <w:r>
           <w:rPr>
             <w:lang w:val="hi_IN" w:bidi="hi_IN"/>
@@ -1362,7 +1515,7 @@
         </w:rPr>
         <w:t xml:space="preserve"> </w:t>
       </w:r>
-      <w:hyperlink r:id="rId20">
+      <w:hyperlink r:id="rId22">
         <w:r>
           <w:rPr>
             <w:lang w:val="hi_IN" w:bidi="hi_IN"/>

</xml_diff>